<commit_message>
Conference Packet: drop the Scavenger Hunt name, fix a rubric space
The model currere is now one of the five curreres read or any piece from
the Currere Exchange Journal, matching Week 6 Wednesday.

Co-Authored-By: Claude Opus 5.5 <noreply@anthropic.com>
</commit_message>
<xml_diff>
--- a/week-07-regressive-the-scene/Conference Packet.docx
+++ b/week-07-regressive-the-scene/Conference Packet.docx
@@ -156,7 +156,7 @@
           <w:sz w:val="22"/>
           <w:szCs w:val="22"/>
         </w:rPr>
-        <w:t xml:space="preserve">Your Scavenger Hunt piece, </w:t>
+        <w:t xml:space="preserve">One of the five curreres we have read, or any piece from the Currere Exchange Journal: </w:t>
       </w:r>
       <w:r>
         <w:rPr>
@@ -164,7 +164,7 @@
           <w:sz w:val="22"/>
           <w:szCs w:val="22"/>
         </w:rPr>
-        <w:t>a published currere whose shape you admire. Include a reference to the reading along with a short commentary discussing</w:t>
+        <w:t>one whose shape you admire. Include a reference to the reading along with a short commentary discussing</w:t>
       </w:r>
       <w:r>
         <w:rPr>
@@ -301,7 +301,7 @@
                 <w:sz w:val="22"/>
                 <w:szCs w:val="22"/>
               </w:rPr>
-              <w:t>Each of the following parts are included: (1) A listing of possible threads along with a discussion of each; (2) a model currere, and (3)Todd-in-a-Can’s read.</w:t>
+              <w:t>Each of the following parts are included: (1) A listing of possible threads along with a discussion of each; (2) a model currere, and (3) Todd-in-a-Can’s read.</w:t>
             </w:r>
           </w:p>
         </w:tc>

</xml_diff>